<commit_message>
Regenerate the example outputs the last mapping change left stale
The geology and hydrogeology maps in all three worked examples, and the
Rokel report that embeds them, were committed before the caption that
says what the geology map does not know. Re-running the three example
scripts on the committed inputs produces these; nothing else changed.

Co-Authored-By: Claude Fable 5.1 <noreply@anthropic.com>
Claude-Session: https://claude.ai/code/session_01C4Y9ne9BzR2JqS3dXJihS2
</commit_message>
<xml_diff>
--- a/examples/projects/rokel/reports/Rokel_Geophysical_Survey_Report.docx
+++ b/examples/projects/rokel/reports/Rokel_Geophysical_Survey_Report.docx
@@ -342,7 +342,7 @@
       <w:r>
         <w:drawing>
           <wp:inline xmlns:a="http://schemas.openxmlformats.org/drawingml/2006/main" xmlns:pic="http://schemas.openxmlformats.org/drawingml/2006/picture">
-            <wp:extent cx="5400000" cy="4602999"/>
+            <wp:extent cx="5400000" cy="4718612"/>
             <wp:docPr id="3" name="Picture 3"/>
             <wp:cNvGraphicFramePr>
               <a:graphicFrameLocks noChangeAspect="1"/>
@@ -363,7 +363,7 @@
                   <pic:spPr>
                     <a:xfrm>
                       <a:off x="0" y="0"/>
-                      <a:ext cx="5400000" cy="4602999"/>
+                      <a:ext cx="5400000" cy="4718612"/>
                     </a:xfrm>
                     <a:prstGeom prst="rect"/>
                   </pic:spPr>
@@ -393,7 +393,7 @@
       <w:r>
         <w:drawing>
           <wp:inline xmlns:a="http://schemas.openxmlformats.org/drawingml/2006/main" xmlns:pic="http://schemas.openxmlformats.org/drawingml/2006/picture">
-            <wp:extent cx="5400000" cy="4526283"/>
+            <wp:extent cx="5400000" cy="4713812"/>
             <wp:docPr id="4" name="Picture 4"/>
             <wp:cNvGraphicFramePr>
               <a:graphicFrameLocks noChangeAspect="1"/>
@@ -414,7 +414,7 @@
                   <pic:spPr>
                     <a:xfrm>
                       <a:off x="0" y="0"/>
-                      <a:ext cx="5400000" cy="4526283"/>
+                      <a:ext cx="5400000" cy="4713812"/>
                     </a:xfrm>
                     <a:prstGeom prst="rect"/>
                   </pic:spPr>

</xml_diff>